<commit_message>
Updating design for MP3
</commit_message>
<xml_diff>
--- a/MP3_Sources/design.docx
+++ b/MP3_Sources/design.docx
@@ -504,12 +504,14 @@
         </w:rPr>
       </w:pPr>
       <w:proofErr w:type="spellStart"/>
+      <w:proofErr w:type="gramStart"/>
       <w:r>
         <w:rPr>
           <w:lang w:val="fr-FR"/>
         </w:rPr>
         <w:t>cont</w:t>
       </w:r>
+      <w:proofErr w:type="gramEnd"/>
       <w:r>
         <w:rPr>
           <w:lang w:val="fr-FR"/>
@@ -548,12 +550,14 @@
         </w:rPr>
       </w:pPr>
       <w:proofErr w:type="spellStart"/>
+      <w:proofErr w:type="gramStart"/>
       <w:r>
         <w:rPr>
           <w:lang w:val="fr-FR"/>
         </w:rPr>
         <w:t>cont</w:t>
       </w:r>
+      <w:proofErr w:type="gramEnd"/>
       <w:r>
         <w:rPr>
           <w:lang w:val="fr-FR"/>
@@ -592,11 +596,19 @@
         </w:rPr>
       </w:pPr>
       <w:proofErr w:type="spellStart"/>
+      <w:proofErr w:type="gramStart"/>
       <w:r>
         <w:rPr>
           <w:lang w:val="fr-FR"/>
         </w:rPr>
-        <w:t>page_table.C</w:t>
+        <w:t>page</w:t>
+      </w:r>
+      <w:proofErr w:type="gramEnd"/>
+      <w:r>
+        <w:rPr>
+          <w:lang w:val="fr-FR"/>
+        </w:rPr>
+        <w:t>_table.C</w:t>
       </w:r>
       <w:proofErr w:type="spellEnd"/>
     </w:p>
@@ -625,13 +637,23 @@
         </w:rPr>
       </w:pPr>
       <w:proofErr w:type="spellStart"/>
+      <w:proofErr w:type="gramStart"/>
       <w:r>
         <w:rPr>
           <w:b/>
           <w:bCs/>
           <w:lang w:val="fr-FR"/>
         </w:rPr>
-        <w:t>cont_frame_pool.H</w:t>
+        <w:t>cont</w:t>
+      </w:r>
+      <w:proofErr w:type="gramEnd"/>
+      <w:r>
+        <w:rPr>
+          <w:b/>
+          <w:bCs/>
+          <w:lang w:val="fr-FR"/>
+        </w:rPr>
+        <w:t>_frame_pool.H</w:t>
       </w:r>
       <w:proofErr w:type="spellEnd"/>
       <w:r>
@@ -798,13 +820,32 @@
         </w:rPr>
       </w:pPr>
       <w:proofErr w:type="spellStart"/>
+      <w:proofErr w:type="gramStart"/>
       <w:r>
         <w:rPr>
           <w:b/>
           <w:bCs/>
           <w:lang w:val="fr-FR"/>
         </w:rPr>
-        <w:t>page_table.C</w:t>
+        <w:t>page</w:t>
+      </w:r>
+      <w:proofErr w:type="gramEnd"/>
+      <w:r>
+        <w:rPr>
+          <w:b/>
+          <w:bCs/>
+          <w:lang w:val="fr-FR"/>
+        </w:rPr>
+        <w:t>_table.</w:t>
+      </w:r>
+      <w:proofErr w:type="gramStart"/>
+      <w:r>
+        <w:rPr>
+          <w:b/>
+          <w:bCs/>
+          <w:lang w:val="fr-FR"/>
+        </w:rPr>
+        <w:t>C</w:t>
       </w:r>
       <w:proofErr w:type="spellEnd"/>
       <w:r>
@@ -813,7 +854,16 @@
           <w:bCs/>
           <w:lang w:val="fr-FR"/>
         </w:rPr>
-        <w:t xml:space="preserve">: </w:t>
+        <w:t>:</w:t>
+      </w:r>
+      <w:proofErr w:type="gramEnd"/>
+      <w:r>
+        <w:rPr>
+          <w:b/>
+          <w:bCs/>
+          <w:lang w:val="fr-FR"/>
+        </w:rPr>
+        <w:t xml:space="preserve"> </w:t>
       </w:r>
       <w:proofErr w:type="spellStart"/>
       <w:r>
@@ -854,7 +904,15 @@
         <w:jc w:val="both"/>
       </w:pPr>
       <w:r>
-        <w:t>This saves pointers for kernel and process frame pools</w:t>
+        <w:t xml:space="preserve">This saves pointers for </w:t>
+      </w:r>
+      <w:proofErr w:type="gramStart"/>
+      <w:r>
+        <w:t>kernel</w:t>
+      </w:r>
+      <w:proofErr w:type="gramEnd"/>
+      <w:r>
+        <w:t xml:space="preserve"> and process frame pools</w:t>
       </w:r>
     </w:p>
     <w:p>
@@ -880,13 +938,32 @@
         </w:rPr>
       </w:pPr>
       <w:proofErr w:type="spellStart"/>
+      <w:proofErr w:type="gramStart"/>
       <w:r>
         <w:rPr>
           <w:b/>
           <w:bCs/>
           <w:lang w:val="fr-FR"/>
         </w:rPr>
-        <w:t>page_table.C</w:t>
+        <w:t>page</w:t>
+      </w:r>
+      <w:proofErr w:type="gramEnd"/>
+      <w:r>
+        <w:rPr>
+          <w:b/>
+          <w:bCs/>
+          <w:lang w:val="fr-FR"/>
+        </w:rPr>
+        <w:t>_table.</w:t>
+      </w:r>
+      <w:proofErr w:type="gramStart"/>
+      <w:r>
+        <w:rPr>
+          <w:b/>
+          <w:bCs/>
+          <w:lang w:val="fr-FR"/>
+        </w:rPr>
+        <w:t>C</w:t>
       </w:r>
       <w:proofErr w:type="spellEnd"/>
       <w:r>
@@ -895,9 +972,19 @@
           <w:bCs/>
           <w:lang w:val="fr-FR"/>
         </w:rPr>
-        <w:t xml:space="preserve">: </w:t>
+        <w:t>:</w:t>
+      </w:r>
+      <w:proofErr w:type="gramEnd"/>
+      <w:r>
+        <w:rPr>
+          <w:b/>
+          <w:bCs/>
+          <w:lang w:val="fr-FR"/>
+        </w:rPr>
+        <w:t xml:space="preserve"> </w:t>
       </w:r>
       <w:proofErr w:type="spellStart"/>
+      <w:proofErr w:type="gramStart"/>
       <w:r>
         <w:rPr>
           <w:b/>
@@ -913,7 +1000,16 @@
           <w:bCs/>
           <w:lang w:val="fr-FR"/>
         </w:rPr>
-        <w:t xml:space="preserve">() </w:t>
+        <w:t>(</w:t>
+      </w:r>
+      <w:proofErr w:type="gramEnd"/>
+      <w:r>
+        <w:rPr>
+          <w:b/>
+          <w:bCs/>
+          <w:lang w:val="fr-FR"/>
+        </w:rPr>
+        <w:t xml:space="preserve">) </w:t>
       </w:r>
       <w:r>
         <w:rPr>
@@ -965,7 +1061,15 @@
         <w:t>Page</w:t>
       </w:r>
       <w:r>
-        <w:t xml:space="preserve"> management). This can handle 1024 entries, meaning it can point to 1024 page table pages in which each has 1024 entries in it.</w:t>
+        <w:t xml:space="preserve"> management). This can handle 1024 entries, meaning it can point to </w:t>
+      </w:r>
+      <w:proofErr w:type="gramStart"/>
+      <w:r>
+        <w:t>1024 page</w:t>
+      </w:r>
+      <w:proofErr w:type="gramEnd"/>
+      <w:r>
+        <w:t xml:space="preserve"> table pages in which each has 1024 entries in it.</w:t>
       </w:r>
     </w:p>
     <w:p>
@@ -1081,13 +1185,32 @@
         </w:rPr>
       </w:pPr>
       <w:proofErr w:type="spellStart"/>
+      <w:proofErr w:type="gramStart"/>
       <w:r>
         <w:rPr>
           <w:b/>
           <w:bCs/>
           <w:lang w:val="fr-FR"/>
         </w:rPr>
-        <w:t>page_table.C</w:t>
+        <w:t>page</w:t>
+      </w:r>
+      <w:proofErr w:type="gramEnd"/>
+      <w:r>
+        <w:rPr>
+          <w:b/>
+          <w:bCs/>
+          <w:lang w:val="fr-FR"/>
+        </w:rPr>
+        <w:t>_table.</w:t>
+      </w:r>
+      <w:proofErr w:type="gramStart"/>
+      <w:r>
+        <w:rPr>
+          <w:b/>
+          <w:bCs/>
+          <w:lang w:val="fr-FR"/>
+        </w:rPr>
+        <w:t>C</w:t>
       </w:r>
       <w:proofErr w:type="spellEnd"/>
       <w:r>
@@ -1096,9 +1219,19 @@
           <w:bCs/>
           <w:lang w:val="fr-FR"/>
         </w:rPr>
-        <w:t xml:space="preserve">: </w:t>
+        <w:t>:</w:t>
+      </w:r>
+      <w:proofErr w:type="gramEnd"/>
+      <w:r>
+        <w:rPr>
+          <w:b/>
+          <w:bCs/>
+          <w:lang w:val="fr-FR"/>
+        </w:rPr>
+        <w:t xml:space="preserve"> </w:t>
       </w:r>
       <w:proofErr w:type="spellStart"/>
+      <w:proofErr w:type="gramStart"/>
       <w:r>
         <w:rPr>
           <w:b/>
@@ -1114,7 +1247,16 @@
           <w:bCs/>
           <w:lang w:val="fr-FR"/>
         </w:rPr>
-        <w:t>()</w:t>
+        <w:t>(</w:t>
+      </w:r>
+      <w:proofErr w:type="gramEnd"/>
+      <w:r>
+        <w:rPr>
+          <w:b/>
+          <w:bCs/>
+          <w:lang w:val="fr-FR"/>
+        </w:rPr>
+        <w:t>)</w:t>
       </w:r>
     </w:p>
     <w:p>
@@ -1166,13 +1308,32 @@
         </w:rPr>
       </w:pPr>
       <w:proofErr w:type="spellStart"/>
+      <w:proofErr w:type="gramStart"/>
       <w:r>
         <w:rPr>
           <w:b/>
           <w:bCs/>
           <w:lang w:val="fr-FR"/>
         </w:rPr>
-        <w:t>page_table.C</w:t>
+        <w:t>page</w:t>
+      </w:r>
+      <w:proofErr w:type="gramEnd"/>
+      <w:r>
+        <w:rPr>
+          <w:b/>
+          <w:bCs/>
+          <w:lang w:val="fr-FR"/>
+        </w:rPr>
+        <w:t>_table.</w:t>
+      </w:r>
+      <w:proofErr w:type="gramStart"/>
+      <w:r>
+        <w:rPr>
+          <w:b/>
+          <w:bCs/>
+          <w:lang w:val="fr-FR"/>
+        </w:rPr>
+        <w:t>C</w:t>
       </w:r>
       <w:proofErr w:type="spellEnd"/>
       <w:r>
@@ -1181,7 +1342,16 @@
           <w:bCs/>
           <w:lang w:val="fr-FR"/>
         </w:rPr>
-        <w:t xml:space="preserve">: </w:t>
+        <w:t>:</w:t>
+      </w:r>
+      <w:proofErr w:type="gramEnd"/>
+      <w:r>
+        <w:rPr>
+          <w:b/>
+          <w:bCs/>
+          <w:lang w:val="fr-FR"/>
+        </w:rPr>
+        <w:t xml:space="preserve"> </w:t>
       </w:r>
       <w:proofErr w:type="spellStart"/>
       <w:r>
@@ -1190,7 +1360,16 @@
           <w:bCs/>
           <w:lang w:val="fr-FR"/>
         </w:rPr>
-        <w:t>enable_paging</w:t>
+        <w:t>enable_</w:t>
+      </w:r>
+      <w:proofErr w:type="gramStart"/>
+      <w:r>
+        <w:rPr>
+          <w:b/>
+          <w:bCs/>
+          <w:lang w:val="fr-FR"/>
+        </w:rPr>
+        <w:t>paging</w:t>
       </w:r>
       <w:proofErr w:type="spellEnd"/>
       <w:r>
@@ -1199,7 +1378,16 @@
           <w:bCs/>
           <w:lang w:val="fr-FR"/>
         </w:rPr>
-        <w:t>()</w:t>
+        <w:t>(</w:t>
+      </w:r>
+      <w:proofErr w:type="gramEnd"/>
+      <w:r>
+        <w:rPr>
+          <w:b/>
+          <w:bCs/>
+          <w:lang w:val="fr-FR"/>
+        </w:rPr>
+        <w:t>)</w:t>
       </w:r>
     </w:p>
     <w:p>
@@ -2126,7 +2314,15 @@
         <w:t>up to</w:t>
       </w:r>
       <w:r>
-        <w:t xml:space="preserve"> 1024 page table pages (1024). This will ideally be the 2</w:t>
+        <w:t xml:space="preserve"> </w:t>
+      </w:r>
+      <w:proofErr w:type="gramStart"/>
+      <w:r>
+        <w:t>1024 page</w:t>
+      </w:r>
+      <w:proofErr w:type="gramEnd"/>
+      <w:r>
+        <w:t xml:space="preserve"> table pages (1024). This will ideally be the 2</w:t>
       </w:r>
       <w:r>
         <w:rPr>
@@ -2156,7 +2352,15 @@
         <w:t>rd</w:t>
       </w:r>
       <w:r>
-        <w:t xml:space="preserve"> frame pointing to the corresponding PDE. Thus first page table has data of directly mapped address locations</w:t>
+        <w:t xml:space="preserve"> frame pointing to the corresponding PDE. </w:t>
+      </w:r>
+      <w:proofErr w:type="gramStart"/>
+      <w:r>
+        <w:t>Thus</w:t>
+      </w:r>
+      <w:proofErr w:type="gramEnd"/>
+      <w:r>
+        <w:t xml:space="preserve"> first page table has data of directly mapped address locations</w:t>
       </w:r>
     </w:p>
     <w:p>
@@ -2408,7 +2612,23 @@
         </w:numPr>
       </w:pPr>
       <w:r>
-        <w:t xml:space="preserve">Since the first page table page is filled with pages of kernel pool, the faulted page should be allocated into a different page table. Now, a new page table is created </w:t>
+        <w:t xml:space="preserve">Since the first page table page is filled with pages of kernel pool, the </w:t>
+      </w:r>
+      <w:proofErr w:type="gramStart"/>
+      <w:r>
+        <w:t>faulted</w:t>
+      </w:r>
+      <w:proofErr w:type="gramEnd"/>
+      <w:r>
+        <w:t xml:space="preserve"> page should be allocated into a different page table. Now, a new page table is </w:t>
+      </w:r>
+      <w:proofErr w:type="gramStart"/>
+      <w:r>
+        <w:t>created</w:t>
+      </w:r>
+      <w:proofErr w:type="gramEnd"/>
+      <w:r>
+        <w:t xml:space="preserve"> </w:t>
       </w:r>
       <w:r>
         <w:t xml:space="preserve">and </w:t>
@@ -2559,14 +2779,11 @@
         <w:ind w:left="1080"/>
       </w:pPr>
       <w:r>
-        <w:rPr>
-          <w:noProof/>
-        </w:rPr>
         <w:drawing>
-          <wp:inline distT="0" distB="0" distL="0" distR="0" wp14:anchorId="1FF66563" wp14:editId="6FD5B9C5">
-            <wp:extent cx="5943600" cy="802005"/>
-            <wp:effectExtent l="0" t="0" r="0" b="0"/>
-            <wp:docPr id="2043465592" name="Picture 1" descr="A close-up of a white background&#10;&#10;AI-generated content may be incorrect."/>
+          <wp:inline distT="0" distB="0" distL="0" distR="0" wp14:anchorId="0DDFA3CC" wp14:editId="20860B02">
+            <wp:extent cx="5943600" cy="795655"/>
+            <wp:effectExtent l="0" t="0" r="0" b="4445"/>
+            <wp:docPr id="1133775658" name="Picture 1" descr="A close-up of a white background&#10;&#10;AI-generated content may be incorrect."/>
             <wp:cNvGraphicFramePr>
               <a:graphicFrameLocks xmlns:a="http://schemas.openxmlformats.org/drawingml/2006/main" noChangeAspect="1"/>
             </wp:cNvGraphicFramePr>
@@ -2574,7 +2791,7 @@
               <a:graphicData uri="http://schemas.openxmlformats.org/drawingml/2006/picture">
                 <pic:pic xmlns:pic="http://schemas.openxmlformats.org/drawingml/2006/picture">
                   <pic:nvPicPr>
-                    <pic:cNvPr id="2043465592" name="Picture 1" descr="A close-up of a white background&#10;&#10;AI-generated content may be incorrect."/>
+                    <pic:cNvPr id="1133775658" name="Picture 1" descr="A close-up of a white background&#10;&#10;AI-generated content may be incorrect."/>
                     <pic:cNvPicPr/>
                   </pic:nvPicPr>
                   <pic:blipFill>
@@ -2586,7 +2803,7 @@
                   <pic:spPr>
                     <a:xfrm>
                       <a:off x="0" y="0"/>
-                      <a:ext cx="5943600" cy="802005"/>
+                      <a:ext cx="5943600" cy="795655"/>
                     </a:xfrm>
                     <a:prstGeom prst="rect">
                       <a:avLst/>

</xml_diff>